<commit_message>
Redesign CV - clean modern formatting, remove colored accents
Co-Authored-By: Claude Opus 4.6 <noreply@anthropic.com>
</commit_message>
<xml_diff>
--- a/CV_ViktorAndreas_GoogleCloud.docx
+++ b/CV_ViktorAndreas_GoogleCloud.docx
@@ -10,58 +10,10 @@
         <w:rPr>
           <w:rFonts w:ascii="Calibri" w:hAnsi="Calibri"/>
           <w:b/>
-          <w:sz w:val="44"/>
+          <w:color w:val="1A1A1A"/>
+          <w:sz w:val="48"/>
         </w:rPr>
         <w:t>Viktor Andreas</w:t>
-      </w:r>
-    </w:p>
-    <w:p>
-      <w:pPr>
-        <w:spacing w:after="40"/>
-      </w:pPr>
-      <w:r>
-        <w:rPr>
-          <w:color w:val="555555"/>
-          <w:sz w:val="19"/>
-        </w:rPr>
-        <w:t>Zurich, Switzerland  |  viktor@salesteq.com  |  linkedin.com/in/viktorandreas</w:t>
-      </w:r>
-    </w:p>
-    <w:p>
-      <w:pPr>
-        <w:spacing w:before="40" w:after="120"/>
-      </w:pPr>
-      <w:r>
-        <w:rPr>
-          <w:color w:val="CCCCCC"/>
-          <w:sz w:val="16"/>
-        </w:rPr>
-        <w:t>_____________________________________________________________________________________</w:t>
-      </w:r>
-    </w:p>
-    <w:p>
-      <w:pPr>
-        <w:spacing w:after="120"/>
-      </w:pPr>
-      <w:r>
-        <w:rPr>
-          <w:sz w:val="20"/>
-        </w:rPr>
-        <w:t>Sales and technology leader with 15+ years in enterprise software, cloud platforms and AI. Built and sold products on Google Cloud (Vertex AI, Gemini, Cloud Run) to enterprise customers and start-ups. Managed teams of up to 60 people across Credit Suisse, Vontobel and two founded companies. Sold multi-million dollar SaaS and PaaS deals to banks, automotive OEMs, insurers and retail corporations globally. MSc in Machine Learning.</w:t>
-      </w:r>
-    </w:p>
-    <w:p>
-      <w:pPr>
-        <w:spacing w:before="240" w:after="80"/>
-      </w:pPr>
-      <w:r>
-        <w:rPr>
-          <w:rFonts w:ascii="Calibri" w:hAnsi="Calibri"/>
-          <w:b/>
-          <w:color w:val="D97757"/>
-          <w:sz w:val="18"/>
-        </w:rPr>
-        <w:t>EXPERIENCE</w:t>
       </w:r>
     </w:p>
     <w:p>
@@ -70,553 +22,66 @@
       </w:pPr>
       <w:r>
         <w:rPr>
-          <w:color w:val="DDDDDD"/>
-          <w:sz w:val="12"/>
+          <w:color w:val="5A5A5A"/>
+          <w:sz w:val="19"/>
         </w:rPr>
-        <w:t>_____________________________________________________________________________________</w:t>
+        <w:t>Zurich, Switzerland     viktor@salesteq.com     linkedin.com/in/viktorandreas</w:t>
       </w:r>
     </w:p>
     <w:p>
       <w:pPr>
-        <w:spacing w:before="160" w:after="20"/>
+        <w:spacing w:after="160"/>
+      </w:pPr>
+    </w:p>
+    <w:p>
+      <w:pPr>
+        <w:spacing w:after="80"/>
+      </w:pPr>
+      <w:r>
+        <w:rPr>
+          <w:color w:val="5A5A5A"/>
+          <w:sz w:val="20"/>
+        </w:rPr>
+        <w:t>Sales and technology leader with 15+ years in enterprise software, cloud platforms and AI. Built and sold products on Google Cloud (Vertex AI, Gemini, Cloud Run) to enterprise customers and start-ups. Managed teams of up to 60 people across Credit Suisse, Vontobel and two founded companies. Sold multi-million dollar SaaS and PaaS deals to banks, automotive OEMs, insurers and retail corporations globally. MSc in Machine Learning.</w:t>
+      </w:r>
+    </w:p>
+    <w:p>
+      <w:pPr>
+        <w:spacing w:before="320" w:after="120"/>
       </w:pPr>
       <w:r>
         <w:rPr>
           <w:rFonts w:ascii="Calibri" w:hAnsi="Calibri"/>
           <w:b/>
-          <w:sz w:val="22"/>
+          <w:color w:val="1B3A5C"/>
+          <w:sz w:val="18"/>
         </w:rPr>
-        <w:t>CEO &amp; Co-Founder</w:t>
+        <w:t>EXPERIENCE</w:t>
       </w:r>
     </w:p>
     <w:p>
       <w:pPr>
-        <w:spacing w:after="60"/>
+        <w:spacing w:after="160"/>
       </w:pPr>
       <w:r>
         <w:rPr>
-          <w:rFonts w:ascii="Calibri" w:hAnsi="Calibri"/>
-          <w:sz w:val="20"/>
+          <w:color w:val="DDDDDD"/>
+          <w:sz w:val="8"/>
         </w:rPr>
-        <w:t>Salesteq (Elyon GmbH)</w:t>
-      </w:r>
-      <w:r>
-        <w:rPr>
-          <w:rFonts w:ascii="Calibri" w:hAnsi="Calibri"/>
-          <w:color w:val="777777"/>
-          <w:sz w:val="18"/>
-        </w:rPr>
-        <w:t xml:space="preserve">  |  Zug, Switzerland  |  2023 — Present</w:t>
+        <w:t>───────────────────────────────────────────────────────────────────────────────────────────────</w:t>
       </w:r>
     </w:p>
     <w:p>
       <w:pPr>
-        <w:spacing w:after="40"/>
+        <w:spacing w:before="200" w:after="20"/>
       </w:pPr>
       <w:r>
         <w:rPr>
-          <w:i/>
-          <w:color w:val="444444"/>
-          <w:sz w:val="19"/>
-        </w:rPr>
-        <w:t>Built and sell an AI platform-as-a-service replacing dealership sales and service teams with autonomous agents. Voice, chat, WhatsApp — 12+ languages, 24/7. Entire stack on Google Cloud.</w:t>
-      </w:r>
-    </w:p>
-    <w:p>
-      <w:pPr>
-        <w:spacing w:after="20"/>
-        <w:ind w:left="288"/>
-      </w:pPr>
-      <w:r>
-        <w:rPr>
-          <w:rFonts w:ascii="Calibri" w:hAnsi="Calibri"/>
-          <w:sz w:val="19"/>
-        </w:rPr>
-        <w:t>–  Defined and executed full go-to-market. Acquired BMW KSA, Naghi Group (250K cars/year, 6 brands), Allianz, Emaar and Suhner as paying customers</w:t>
-      </w:r>
-    </w:p>
-    <w:p>
-      <w:pPr>
-        <w:spacing w:after="20"/>
-        <w:ind w:left="288"/>
-      </w:pPr>
-      <w:r>
-        <w:rPr>
-          <w:rFonts w:ascii="Calibri" w:hAnsi="Calibri"/>
-          <w:sz w:val="19"/>
-        </w:rPr>
-        <w:t>–  Closed enterprise deals through live technical PoCs — single demo to signed contract in under 30 days</w:t>
-      </w:r>
-    </w:p>
-    <w:p>
-      <w:pPr>
-        <w:spacing w:after="20"/>
-        <w:ind w:left="288"/>
-      </w:pPr>
-      <w:r>
-        <w:rPr>
-          <w:rFonts w:ascii="Calibri" w:hAnsi="Calibri"/>
-          <w:sz w:val="19"/>
-        </w:rPr>
-        <w:t>–  Built and lead cross-functional team across engineering, AI research, sales and customer success in Switzerland and Saudi Arabia</w:t>
-      </w:r>
-    </w:p>
-    <w:p>
-      <w:pPr>
-        <w:spacing w:after="20"/>
-        <w:ind w:left="288"/>
-      </w:pPr>
-      <w:r>
-        <w:rPr>
-          <w:rFonts w:ascii="Calibri" w:hAnsi="Calibri"/>
-          <w:sz w:val="19"/>
-        </w:rPr>
-        <w:t>–  Platform processes 4,000+ voice calls/month, 300 daily autonomous interactions, zero human handoff</w:t>
-      </w:r>
-    </w:p>
-    <w:p>
-      <w:pPr>
-        <w:spacing w:after="20"/>
-        <w:ind w:left="288"/>
-      </w:pPr>
-      <w:r>
-        <w:rPr>
-          <w:rFonts w:ascii="Calibri" w:hAnsi="Calibri"/>
-          <w:sz w:val="19"/>
-        </w:rPr>
-        <w:t>–  Production on GCP: Vertex AI, Gemini models, Cloud Run, BigQuery. Voice pipeline at sub-400ms latency</w:t>
-      </w:r>
-    </w:p>
-    <w:p>
-      <w:pPr>
-        <w:spacing w:after="20"/>
-        <w:ind w:left="288"/>
-      </w:pPr>
-      <w:r>
-        <w:rPr>
-          <w:rFonts w:ascii="Calibri" w:hAnsi="Calibri"/>
-          <w:sz w:val="19"/>
-        </w:rPr>
-        <w:t>–  NVIDIA Inception member. Working with Google for Startups team in Zurich</w:t>
-      </w:r>
-    </w:p>
-    <w:p>
-      <w:pPr>
-        <w:spacing w:after="20"/>
-        <w:ind w:left="288"/>
-      </w:pPr>
-      <w:r>
-        <w:rPr>
-          <w:rFonts w:ascii="Calibri" w:hAnsi="Calibri"/>
-          <w:sz w:val="19"/>
-        </w:rPr>
-        <w:t>–  Assembled advisory board: ex-CFO Sitecore, ex-CRO EMEA SAP, ex-Managing Director BMW Middle East</w:t>
-      </w:r>
-    </w:p>
-    <w:p>
-      <w:pPr>
-        <w:spacing w:before="160" w:after="20"/>
-      </w:pPr>
-      <w:r>
-        <w:rPr>
-          <w:rFonts w:ascii="Calibri" w:hAnsi="Calibri"/>
           <w:b/>
+          <w:color w:val="1A1A1A"/>
           <w:sz w:val="22"/>
         </w:rPr>
-        <w:t>Commercial Lead &amp; ML Product</w:t>
-      </w:r>
-    </w:p>
-    <w:p>
-      <w:pPr>
-        <w:spacing w:after="60"/>
-      </w:pPr>
-      <w:r>
-        <w:rPr>
-          <w:rFonts w:ascii="Calibri" w:hAnsi="Calibri"/>
-          <w:sz w:val="20"/>
-        </w:rPr>
-        <w:t>Cobalt ELN</w:t>
-      </w:r>
-      <w:r>
-        <w:rPr>
-          <w:rFonts w:ascii="Calibri" w:hAnsi="Calibri"/>
-          <w:color w:val="777777"/>
-          <w:sz w:val="18"/>
-        </w:rPr>
-        <w:t xml:space="preserve">  |  Basel / Open Source  |  December 2021 — January 2024</w:t>
-      </w:r>
-    </w:p>
-    <w:p>
-      <w:pPr>
-        <w:spacing w:after="40"/>
-      </w:pPr>
-      <w:r>
-        <w:rPr>
-          <w:i/>
-          <w:color w:val="444444"/>
-          <w:sz w:val="19"/>
-        </w:rPr>
-        <w:t>Drove commercial adoption and ML tooling for an open-source electronic lab notebook. Partnership with University of Basel.</w:t>
-      </w:r>
-    </w:p>
-    <w:p>
-      <w:pPr>
-        <w:spacing w:after="20"/>
-        <w:ind w:left="288"/>
-      </w:pPr>
-      <w:r>
-        <w:rPr>
-          <w:rFonts w:ascii="Calibri" w:hAnsi="Calibri"/>
-          <w:sz w:val="19"/>
-        </w:rPr>
-        <w:t>–  Sold and positioned the platform to research institutions and university labs</w:t>
-      </w:r>
-    </w:p>
-    <w:p>
-      <w:pPr>
-        <w:spacing w:after="20"/>
-        <w:ind w:left="288"/>
-      </w:pPr>
-      <w:r>
-        <w:rPr>
-          <w:rFonts w:ascii="Calibri" w:hAnsi="Calibri"/>
-          <w:sz w:val="19"/>
-        </w:rPr>
-        <w:t>–  Worked with ML engineering team on Google model integration — classification, data extraction, experiment automation</w:t>
-      </w:r>
-    </w:p>
-    <w:p>
-      <w:pPr>
-        <w:spacing w:after="20"/>
-        <w:ind w:left="288"/>
-      </w:pPr>
-      <w:r>
-        <w:rPr>
-          <w:rFonts w:ascii="Calibri" w:hAnsi="Calibri"/>
-          <w:sz w:val="19"/>
-        </w:rPr>
-        <w:t>–  Managed the open-source community on GitHub — contributor relations, roadmap input from researchers</w:t>
-      </w:r>
-    </w:p>
-    <w:p>
-      <w:pPr>
-        <w:spacing w:after="20"/>
-        <w:ind w:left="288"/>
-      </w:pPr>
-      <w:r>
-        <w:rPr>
-          <w:rFonts w:ascii="Calibri" w:hAnsi="Calibri"/>
-          <w:sz w:val="19"/>
-        </w:rPr>
-        <w:t>–  Grew user community across pharmaceutical and life science research groups</w:t>
-      </w:r>
-    </w:p>
-    <w:p>
-      <w:pPr>
-        <w:spacing w:before="160" w:after="20"/>
-      </w:pPr>
-      <w:r>
-        <w:rPr>
-          <w:rFonts w:ascii="Calibri" w:hAnsi="Calibri"/>
-          <w:b/>
-          <w:sz w:val="22"/>
-        </w:rPr>
-        <w:t>Co-Founder &amp; CRO</w:t>
-      </w:r>
-    </w:p>
-    <w:p>
-      <w:pPr>
-        <w:spacing w:after="60"/>
-      </w:pPr>
-      <w:r>
-        <w:rPr>
-          <w:rFonts w:ascii="Calibri" w:hAnsi="Calibri"/>
-          <w:sz w:val="20"/>
-        </w:rPr>
-        <w:t>Lykke Business AG</w:t>
-      </w:r>
-      <w:r>
-        <w:rPr>
-          <w:rFonts w:ascii="Calibri" w:hAnsi="Calibri"/>
-          <w:color w:val="777777"/>
-          <w:sz w:val="18"/>
-        </w:rPr>
-        <w:t xml:space="preserve">  |  Zurich, Switzerland  |  November 2018 — July 2020</w:t>
-      </w:r>
-    </w:p>
-    <w:p>
-      <w:pPr>
-        <w:spacing w:after="40"/>
-      </w:pPr>
-      <w:r>
-        <w:rPr>
-          <w:i/>
-          <w:color w:val="444444"/>
-          <w:sz w:val="19"/>
-        </w:rPr>
-        <w:t>Led global SaaS sales for an enterprise platform with data analytics and trading tools. Built and ran a quota-carrying team of 60.</w:t>
-      </w:r>
-    </w:p>
-    <w:p>
-      <w:pPr>
-        <w:spacing w:after="20"/>
-        <w:ind w:left="288"/>
-      </w:pPr>
-      <w:r>
-        <w:rPr>
-          <w:rFonts w:ascii="Calibri" w:hAnsi="Calibri"/>
-          <w:sz w:val="19"/>
-        </w:rPr>
-        <w:t>–  Grew revenue from single-digit millions to eight figures, selling to banks, financial institutions and large retail corporations including Emaar</w:t>
-      </w:r>
-    </w:p>
-    <w:p>
-      <w:pPr>
-        <w:spacing w:after="20"/>
-        <w:ind w:left="288"/>
-      </w:pPr>
-      <w:r>
-        <w:rPr>
-          <w:rFonts w:ascii="Calibri" w:hAnsi="Calibri"/>
-          <w:sz w:val="19"/>
-        </w:rPr>
-        <w:t>–  Built and managed a 60-person organization across sales, business development, product and operations</w:t>
-      </w:r>
-    </w:p>
-    <w:p>
-      <w:pPr>
-        <w:spacing w:after="20"/>
-        <w:ind w:left="288"/>
-      </w:pPr>
-      <w:r>
-        <w:rPr>
-          <w:rFonts w:ascii="Calibri" w:hAnsi="Calibri"/>
-          <w:sz w:val="19"/>
-        </w:rPr>
-        <w:t>–  Closed multi-million USD platform deals across DACH, Middle East and Asia</w:t>
-      </w:r>
-    </w:p>
-    <w:p>
-      <w:pPr>
-        <w:spacing w:after="20"/>
-        <w:ind w:left="288"/>
-      </w:pPr>
-      <w:r>
-        <w:rPr>
-          <w:rFonts w:ascii="Calibri" w:hAnsi="Calibri"/>
-          <w:sz w:val="19"/>
-        </w:rPr>
-        <w:t>–  Defined pricing, sales playbooks and channel partnerships for institutional SaaS distribution</w:t>
-      </w:r>
-    </w:p>
-    <w:p>
-      <w:pPr>
-        <w:spacing w:before="160" w:after="20"/>
-      </w:pPr>
-      <w:r>
-        <w:rPr>
-          <w:rFonts w:ascii="Calibri" w:hAnsi="Calibri"/>
-          <w:b/>
-          <w:sz w:val="22"/>
-        </w:rPr>
-        <w:t>Product Manager — Wealth Platform</w:t>
-      </w:r>
-    </w:p>
-    <w:p>
-      <w:pPr>
-        <w:spacing w:after="60"/>
-      </w:pPr>
-      <w:r>
-        <w:rPr>
-          <w:rFonts w:ascii="Calibri" w:hAnsi="Calibri"/>
-          <w:sz w:val="20"/>
-        </w:rPr>
-        <w:t>Vontobel AG</w:t>
-      </w:r>
-      <w:r>
-        <w:rPr>
-          <w:rFonts w:ascii="Calibri" w:hAnsi="Calibri"/>
-          <w:color w:val="777777"/>
-          <w:sz w:val="18"/>
-        </w:rPr>
-        <w:t xml:space="preserve">  |  Zurich, Switzerland  |  August 2017 — September 2018</w:t>
-      </w:r>
-    </w:p>
-    <w:p>
-      <w:pPr>
-        <w:spacing w:after="40"/>
-      </w:pPr>
-      <w:r>
-        <w:rPr>
-          <w:i/>
-          <w:color w:val="444444"/>
-          <w:sz w:val="19"/>
-        </w:rPr>
-        <w:t>Owned the product and commercial side of one of Europe’s leading digital wealth applications. Hybrid role — half product, half enterprise sales.</w:t>
-      </w:r>
-    </w:p>
-    <w:p>
-      <w:pPr>
-        <w:spacing w:after="20"/>
-        <w:ind w:left="288"/>
-      </w:pPr>
-      <w:r>
-        <w:rPr>
-          <w:rFonts w:ascii="Calibri" w:hAnsi="Calibri"/>
-          <w:sz w:val="19"/>
-        </w:rPr>
-        <w:t>–  Ran enterprise sales cycles end to end — from first call and technical scoping through to contract close with private banks</w:t>
-      </w:r>
-    </w:p>
-    <w:p>
-      <w:pPr>
-        <w:spacing w:after="20"/>
-        <w:ind w:left="288"/>
-      </w:pPr>
-      <w:r>
-        <w:rPr>
-          <w:rFonts w:ascii="Calibri" w:hAnsi="Calibri"/>
-          <w:sz w:val="19"/>
-        </w:rPr>
-        <w:t>–  Grew platform adoption across private banking and institutional asset management clients in DACH</w:t>
-      </w:r>
-    </w:p>
-    <w:p>
-      <w:pPr>
-        <w:spacing w:after="20"/>
-        <w:ind w:left="288"/>
-      </w:pPr>
-      <w:r>
-        <w:rPr>
-          <w:rFonts w:ascii="Calibri" w:hAnsi="Calibri"/>
-          <w:sz w:val="19"/>
-        </w:rPr>
-        <w:t>–  Sat between clients and engineering — turned what wealth managers actually needed into features that shipped</w:t>
-      </w:r>
-    </w:p>
-    <w:p>
-      <w:pPr>
-        <w:spacing w:after="20"/>
-        <w:ind w:left="288"/>
-      </w:pPr>
-      <w:r>
-        <w:rPr>
-          <w:rFonts w:ascii="Calibri" w:hAnsi="Calibri"/>
-          <w:sz w:val="19"/>
-        </w:rPr>
-        <w:t>–  Navigated regulated environments: Swiss banking compliance, data sovereignty requirements, integration with legacy core banking systems</w:t>
-      </w:r>
-    </w:p>
-    <w:p>
-      <w:pPr>
-        <w:spacing w:before="160" w:after="20"/>
-      </w:pPr>
-      <w:r>
-        <w:rPr>
-          <w:rFonts w:ascii="Calibri" w:hAnsi="Calibri"/>
-          <w:b/>
-          <w:sz w:val="22"/>
-        </w:rPr>
-        <w:t>Portfolio Application Lead</w:t>
-      </w:r>
-    </w:p>
-    <w:p>
-      <w:pPr>
-        <w:spacing w:after="60"/>
-      </w:pPr>
-      <w:r>
-        <w:rPr>
-          <w:rFonts w:ascii="Calibri" w:hAnsi="Calibri"/>
-          <w:sz w:val="20"/>
-        </w:rPr>
-        <w:t>Credit Suisse AG</w:t>
-      </w:r>
-      <w:r>
-        <w:rPr>
-          <w:rFonts w:ascii="Calibri" w:hAnsi="Calibri"/>
-          <w:color w:val="777777"/>
-          <w:sz w:val="18"/>
-        </w:rPr>
-        <w:t xml:space="preserve">  |  Zurich, Switzerland  |  March 2013 — June 2017</w:t>
-      </w:r>
-    </w:p>
-    <w:p>
-      <w:pPr>
-        <w:spacing w:after="40"/>
-      </w:pPr>
-      <w:r>
-        <w:rPr>
-          <w:i/>
-          <w:color w:val="444444"/>
-          <w:sz w:val="19"/>
-        </w:rPr>
-        <w:t>Ran a global-scale portfolio application with a team of 50.</w:t>
-      </w:r>
-    </w:p>
-    <w:p>
-      <w:pPr>
-        <w:spacing w:after="20"/>
-        <w:ind w:left="288"/>
-      </w:pPr>
-      <w:r>
-        <w:rPr>
-          <w:rFonts w:ascii="Calibri" w:hAnsi="Calibri"/>
-          <w:sz w:val="19"/>
-        </w:rPr>
-        <w:t>–  Managed 50 people across development, operations and business analysis for a bank-wide portfolio platform</w:t>
-      </w:r>
-    </w:p>
-    <w:p>
-      <w:pPr>
-        <w:spacing w:after="20"/>
-        <w:ind w:left="288"/>
-      </w:pPr>
-      <w:r>
-        <w:rPr>
-          <w:rFonts w:ascii="Calibri" w:hAnsi="Calibri"/>
-          <w:sz w:val="19"/>
-        </w:rPr>
-        <w:t>–  Owned the application on global scale — reliability, feature delivery and stakeholder management across front office, risk and operations</w:t>
-      </w:r>
-    </w:p>
-    <w:p>
-      <w:pPr>
-        <w:spacing w:after="20"/>
-        <w:ind w:left="288"/>
-      </w:pPr>
-      <w:r>
-        <w:rPr>
-          <w:rFonts w:ascii="Calibri" w:hAnsi="Calibri"/>
-          <w:sz w:val="19"/>
-        </w:rPr>
-        <w:t>–  Coordinated cross-functional delivery across trading desks, risk management and compliance</w:t>
-      </w:r>
-    </w:p>
-    <w:p>
-      <w:pPr>
-        <w:spacing w:after="20"/>
-        <w:ind w:left="288"/>
-      </w:pPr>
-      <w:r>
-        <w:rPr>
-          <w:rFonts w:ascii="Calibri" w:hAnsi="Calibri"/>
-          <w:sz w:val="19"/>
-        </w:rPr>
-        <w:t>–  High-availability environment serving thousands of internal users across multiple regions</w:t>
-      </w:r>
-    </w:p>
-    <w:p>
-      <w:pPr>
-        <w:spacing w:before="240" w:after="80"/>
-      </w:pPr>
-      <w:r>
-        <w:rPr>
-          <w:rFonts w:ascii="Calibri" w:hAnsi="Calibri"/>
-          <w:b/>
-          <w:color w:val="D97757"/>
-          <w:sz w:val="18"/>
-        </w:rPr>
-        <w:t>EDUCATION</w:t>
+        <w:t>CEO &amp; Co-Founder</w:t>
       </w:r>
     </w:p>
     <w:p>
@@ -625,72 +90,17 @@
       </w:pPr>
       <w:r>
         <w:rPr>
-          <w:color w:val="DDDDDD"/>
-          <w:sz w:val="12"/>
+          <w:color w:val="1A1A1A"/>
+          <w:sz w:val="20"/>
         </w:rPr>
-        <w:t>_____________________________________________________________________________________</w:t>
+        <w:t>Salesteq (Elyon GmbH)</w:t>
       </w:r>
-    </w:p>
-    <w:p>
-      <w:pPr>
-        <w:spacing w:before="80"/>
-      </w:pPr>
       <w:r>
         <w:rPr>
-          <w:b/>
-          <w:sz w:val="20"/>
-        </w:rPr>
-        <w:t>MSc, Software Engineering &amp; Machine Learning</w:t>
-      </w:r>
-    </w:p>
-    <w:p>
-      <w:pPr>
-        <w:spacing w:after="40"/>
-      </w:pPr>
-      <w:r>
-        <w:rPr>
-          <w:color w:val="555555"/>
-          <w:sz w:val="19"/>
-        </w:rPr>
-        <w:t>Hong Kong Polytechnic University  |  2012 — 2013  |  Grade: 1.5 (top 10%)</w:t>
-      </w:r>
-    </w:p>
-    <w:p>
-      <w:pPr>
-        <w:spacing w:before="120"/>
-      </w:pPr>
-      <w:r>
-        <w:rPr>
-          <w:b/>
-          <w:sz w:val="20"/>
-        </w:rPr>
-        <w:t>BSc, Enterprise Information Systems</w:t>
-      </w:r>
-    </w:p>
-    <w:p>
-      <w:pPr>
-        <w:spacing w:after="40"/>
-      </w:pPr>
-      <w:r>
-        <w:rPr>
-          <w:color w:val="555555"/>
-          <w:sz w:val="19"/>
-        </w:rPr>
-        <w:t>University of Applied Sciences Konstanz, Germany  |  2010 — 2013  |  Grade: 1.5 (top 10%)</w:t>
-      </w:r>
-    </w:p>
-    <w:p>
-      <w:pPr>
-        <w:spacing w:before="240" w:after="80"/>
-      </w:pPr>
-      <w:r>
-        <w:rPr>
-          <w:rFonts w:ascii="Calibri" w:hAnsi="Calibri"/>
-          <w:b/>
-          <w:color w:val="D97757"/>
+          <w:color w:val="999999"/>
           <w:sz w:val="18"/>
         </w:rPr>
-        <w:t>LANGUAGES</w:t>
+        <w:t xml:space="preserve">    Zug, Switzerland    2023 — Present</w:t>
       </w:r>
     </w:p>
     <w:p>
@@ -699,32 +109,115 @@
       </w:pPr>
       <w:r>
         <w:rPr>
-          <w:color w:val="DDDDDD"/>
-          <w:sz w:val="12"/>
+          <w:i/>
+          <w:color w:val="5A5A5A"/>
+          <w:sz w:val="19"/>
         </w:rPr>
-        <w:t>_____________________________________________________________________________________</w:t>
-      </w:r>
-    </w:p>
-    <w:p>
-      <w:r>
-        <w:rPr>
-          <w:sz w:val="20"/>
-        </w:rPr>
-        <w:t>English (native)  ·  Russian (native)  ·  German (professional)</w:t>
+        <w:t>Built and sell an AI platform-as-a-service replacing dealership sales and service teams with autonomous agents. Voice, chat, WhatsApp — 12+ languages, 24/7. Entire stack on Google Cloud.</w:t>
       </w:r>
     </w:p>
     <w:p>
       <w:pPr>
-        <w:spacing w:before="240" w:after="80"/>
+        <w:spacing w:after="40"/>
+        <w:ind w:left="216"/>
       </w:pPr>
       <w:r>
         <w:rPr>
-          <w:rFonts w:ascii="Calibri" w:hAnsi="Calibri"/>
+          <w:color w:val="1A1A1A"/>
+          <w:sz w:val="19"/>
+        </w:rPr>
+        <w:t>•  Defined and executed full go-to-market. Acquired BMW KSA, Naghi Group (250K cars/year, 6 brands), Allianz, Emaar and Suhner as paying customers</w:t>
+      </w:r>
+    </w:p>
+    <w:p>
+      <w:pPr>
+        <w:spacing w:after="40"/>
+        <w:ind w:left="216"/>
+      </w:pPr>
+      <w:r>
+        <w:rPr>
+          <w:color w:val="1A1A1A"/>
+          <w:sz w:val="19"/>
+        </w:rPr>
+        <w:t>•  Closed enterprise deals through live technical PoCs — single demo to signed contract in under 30 days</w:t>
+      </w:r>
+    </w:p>
+    <w:p>
+      <w:pPr>
+        <w:spacing w:after="40"/>
+        <w:ind w:left="216"/>
+      </w:pPr>
+      <w:r>
+        <w:rPr>
+          <w:color w:val="1A1A1A"/>
+          <w:sz w:val="19"/>
+        </w:rPr>
+        <w:t>•  Built and lead cross-functional team across engineering, AI research, sales and customer success in Switzerland and Saudi Arabia</w:t>
+      </w:r>
+    </w:p>
+    <w:p>
+      <w:pPr>
+        <w:spacing w:after="40"/>
+        <w:ind w:left="216"/>
+      </w:pPr>
+      <w:r>
+        <w:rPr>
+          <w:color w:val="1A1A1A"/>
+          <w:sz w:val="19"/>
+        </w:rPr>
+        <w:t>•  Platform processes 4,000+ voice calls/month, 300 daily autonomous interactions, zero human handoff</w:t>
+      </w:r>
+    </w:p>
+    <w:p>
+      <w:pPr>
+        <w:spacing w:after="40"/>
+        <w:ind w:left="216"/>
+      </w:pPr>
+      <w:r>
+        <w:rPr>
+          <w:color w:val="1A1A1A"/>
+          <w:sz w:val="19"/>
+        </w:rPr>
+        <w:t>•  Production on GCP: Vertex AI, Gemini models, Cloud Run, BigQuery. Voice pipeline at sub-400ms latency</w:t>
+      </w:r>
+    </w:p>
+    <w:p>
+      <w:pPr>
+        <w:spacing w:after="40"/>
+        <w:ind w:left="216"/>
+      </w:pPr>
+      <w:r>
+        <w:rPr>
+          <w:color w:val="1A1A1A"/>
+          <w:sz w:val="19"/>
+        </w:rPr>
+        <w:t>•  NVIDIA Inception member. Working with Google for Startups team in Zurich</w:t>
+      </w:r>
+    </w:p>
+    <w:p>
+      <w:pPr>
+        <w:spacing w:after="40"/>
+        <w:ind w:left="216"/>
+      </w:pPr>
+      <w:r>
+        <w:rPr>
+          <w:color w:val="1A1A1A"/>
+          <w:sz w:val="19"/>
+        </w:rPr>
+        <w:t>•  Assembled advisory board: ex-CFO Sitecore, ex-CRO EMEA SAP, ex-Managing Director BMW Middle East</w:t>
+      </w:r>
+    </w:p>
+    <w:p>
+      <w:pPr>
+        <w:spacing w:before="200" w:after="20"/>
+      </w:pPr>
+      <w:r>
+        <w:rPr>
           <w:b/>
-          <w:color w:val="D97757"/>
-          <w:sz w:val="18"/>
+          <w:color w:val="1A1A1A"/>
+          <w:sz w:val="22"/>
         </w:rPr>
-        <w:t>SELECTED WINS</w:t>
+        <w:t>Commercial Lead &amp; ML Product</w:t>
       </w:r>
     </w:p>
     <w:p>
@@ -733,119 +226,489 @@
       </w:pPr>
       <w:r>
         <w:rPr>
+          <w:color w:val="1A1A1A"/>
+          <w:sz w:val="20"/>
+        </w:rPr>
+        <w:t>Cobalt ELN</w:t>
+      </w:r>
+      <w:r>
+        <w:rPr>
+          <w:color w:val="999999"/>
+          <w:sz w:val="18"/>
+        </w:rPr>
+        <w:t xml:space="preserve">    Basel / Open Source    December 2021 — January 2024</w:t>
+      </w:r>
+    </w:p>
+    <w:p>
+      <w:pPr>
+        <w:spacing w:after="80"/>
+      </w:pPr>
+      <w:r>
+        <w:rPr>
+          <w:i/>
+          <w:color w:val="5A5A5A"/>
+          <w:sz w:val="19"/>
+        </w:rPr>
+        <w:t>Drove commercial adoption and ML tooling for an open-source electronic lab notebook. Partnership with University of Basel.</w:t>
+      </w:r>
+    </w:p>
+    <w:p>
+      <w:pPr>
+        <w:spacing w:after="40"/>
+        <w:ind w:left="216"/>
+      </w:pPr>
+      <w:r>
+        <w:rPr>
+          <w:color w:val="1A1A1A"/>
+          <w:sz w:val="19"/>
+        </w:rPr>
+        <w:t>•  Sold and positioned the platform to research institutions and university labs</w:t>
+      </w:r>
+    </w:p>
+    <w:p>
+      <w:pPr>
+        <w:spacing w:after="40"/>
+        <w:ind w:left="216"/>
+      </w:pPr>
+      <w:r>
+        <w:rPr>
+          <w:color w:val="1A1A1A"/>
+          <w:sz w:val="19"/>
+        </w:rPr>
+        <w:t>•  Worked with ML engineering team on Google model integration — classification, data extraction, experiment automation</w:t>
+      </w:r>
+    </w:p>
+    <w:p>
+      <w:pPr>
+        <w:spacing w:after="40"/>
+        <w:ind w:left="216"/>
+      </w:pPr>
+      <w:r>
+        <w:rPr>
+          <w:color w:val="1A1A1A"/>
+          <w:sz w:val="19"/>
+        </w:rPr>
+        <w:t>•  Managed the open-source community on GitHub — contributor relations, roadmap input from researchers</w:t>
+      </w:r>
+    </w:p>
+    <w:p>
+      <w:pPr>
+        <w:spacing w:after="40"/>
+        <w:ind w:left="216"/>
+      </w:pPr>
+      <w:r>
+        <w:rPr>
+          <w:color w:val="1A1A1A"/>
+          <w:sz w:val="19"/>
+        </w:rPr>
+        <w:t>•  Grew user community across pharmaceutical and life science research groups</w:t>
+      </w:r>
+    </w:p>
+    <w:p>
+      <w:pPr>
+        <w:spacing w:before="200" w:after="20"/>
+      </w:pPr>
+      <w:r>
+        <w:rPr>
+          <w:b/>
+          <w:color w:val="1A1A1A"/>
+          <w:sz w:val="22"/>
+        </w:rPr>
+        <w:t>Co-Founder &amp; CRO</w:t>
+      </w:r>
+    </w:p>
+    <w:p>
+      <w:pPr>
+        <w:spacing w:after="80"/>
+      </w:pPr>
+      <w:r>
+        <w:rPr>
+          <w:color w:val="1A1A1A"/>
+          <w:sz w:val="20"/>
+        </w:rPr>
+        <w:t>Lykke Business AG</w:t>
+      </w:r>
+      <w:r>
+        <w:rPr>
+          <w:color w:val="999999"/>
+          <w:sz w:val="18"/>
+        </w:rPr>
+        <w:t xml:space="preserve">    Zurich, Switzerland    November 2018 — July 2020</w:t>
+      </w:r>
+    </w:p>
+    <w:p>
+      <w:pPr>
+        <w:spacing w:after="80"/>
+      </w:pPr>
+      <w:r>
+        <w:rPr>
+          <w:i/>
+          <w:color w:val="5A5A5A"/>
+          <w:sz w:val="19"/>
+        </w:rPr>
+        <w:t>Led global SaaS sales for an enterprise platform with data analytics and trading tools. Built and ran a quota-carrying team of 60.</w:t>
+      </w:r>
+    </w:p>
+    <w:p>
+      <w:pPr>
+        <w:spacing w:after="40"/>
+        <w:ind w:left="216"/>
+      </w:pPr>
+      <w:r>
+        <w:rPr>
+          <w:color w:val="1A1A1A"/>
+          <w:sz w:val="19"/>
+        </w:rPr>
+        <w:t>•  Grew revenue from single-digit millions to eight figures, selling to banks, financial institutions and large retail corporations including Emaar</w:t>
+      </w:r>
+    </w:p>
+    <w:p>
+      <w:pPr>
+        <w:spacing w:after="40"/>
+        <w:ind w:left="216"/>
+      </w:pPr>
+      <w:r>
+        <w:rPr>
+          <w:color w:val="1A1A1A"/>
+          <w:sz w:val="19"/>
+        </w:rPr>
+        <w:t>•  Built and managed a 60-person organization across sales, business development, product and operations</w:t>
+      </w:r>
+    </w:p>
+    <w:p>
+      <w:pPr>
+        <w:spacing w:after="40"/>
+        <w:ind w:left="216"/>
+      </w:pPr>
+      <w:r>
+        <w:rPr>
+          <w:color w:val="1A1A1A"/>
+          <w:sz w:val="19"/>
+        </w:rPr>
+        <w:t>•  Closed multi-million USD platform deals across DACH, Middle East and Asia</w:t>
+      </w:r>
+    </w:p>
+    <w:p>
+      <w:pPr>
+        <w:spacing w:after="40"/>
+        <w:ind w:left="216"/>
+      </w:pPr>
+      <w:r>
+        <w:rPr>
+          <w:color w:val="1A1A1A"/>
+          <w:sz w:val="19"/>
+        </w:rPr>
+        <w:t>•  Defined pricing, sales playbooks and channel partnerships for institutional SaaS distribution</w:t>
+      </w:r>
+    </w:p>
+    <w:p>
+      <w:pPr>
+        <w:spacing w:before="200" w:after="20"/>
+      </w:pPr>
+      <w:r>
+        <w:rPr>
+          <w:b/>
+          <w:color w:val="1A1A1A"/>
+          <w:sz w:val="22"/>
+        </w:rPr>
+        <w:t>Product Manager — Wealth Platform</w:t>
+      </w:r>
+    </w:p>
+    <w:p>
+      <w:pPr>
+        <w:spacing w:after="80"/>
+      </w:pPr>
+      <w:r>
+        <w:rPr>
+          <w:color w:val="1A1A1A"/>
+          <w:sz w:val="20"/>
+        </w:rPr>
+        <w:t>Vontobel AG</w:t>
+      </w:r>
+      <w:r>
+        <w:rPr>
+          <w:color w:val="999999"/>
+          <w:sz w:val="18"/>
+        </w:rPr>
+        <w:t xml:space="preserve">    Zurich, Switzerland    August 2017 — September 2018</w:t>
+      </w:r>
+    </w:p>
+    <w:p>
+      <w:pPr>
+        <w:spacing w:after="80"/>
+      </w:pPr>
+      <w:r>
+        <w:rPr>
+          <w:i/>
+          <w:color w:val="5A5A5A"/>
+          <w:sz w:val="19"/>
+        </w:rPr>
+        <w:t>Owned the product and commercial side of one of Europe’s leading digital wealth applications. Hybrid role — half product, half enterprise sales.</w:t>
+      </w:r>
+    </w:p>
+    <w:p>
+      <w:pPr>
+        <w:spacing w:after="40"/>
+        <w:ind w:left="216"/>
+      </w:pPr>
+      <w:r>
+        <w:rPr>
+          <w:color w:val="1A1A1A"/>
+          <w:sz w:val="19"/>
+        </w:rPr>
+        <w:t>•  Ran enterprise sales cycles end to end — from first call and technical scoping through to contract close with private banks</w:t>
+      </w:r>
+    </w:p>
+    <w:p>
+      <w:pPr>
+        <w:spacing w:after="40"/>
+        <w:ind w:left="216"/>
+      </w:pPr>
+      <w:r>
+        <w:rPr>
+          <w:color w:val="1A1A1A"/>
+          <w:sz w:val="19"/>
+        </w:rPr>
+        <w:t>•  Grew platform adoption across private banking and institutional asset management clients in DACH</w:t>
+      </w:r>
+    </w:p>
+    <w:p>
+      <w:pPr>
+        <w:spacing w:after="40"/>
+        <w:ind w:left="216"/>
+      </w:pPr>
+      <w:r>
+        <w:rPr>
+          <w:color w:val="1A1A1A"/>
+          <w:sz w:val="19"/>
+        </w:rPr>
+        <w:t>•  Sat between clients and engineering — turned what wealth managers actually needed into features that shipped</w:t>
+      </w:r>
+    </w:p>
+    <w:p>
+      <w:pPr>
+        <w:spacing w:after="40"/>
+        <w:ind w:left="216"/>
+      </w:pPr>
+      <w:r>
+        <w:rPr>
+          <w:color w:val="1A1A1A"/>
+          <w:sz w:val="19"/>
+        </w:rPr>
+        <w:t>•  Navigated regulated environments: Swiss banking compliance, data sovereignty, legacy core banking integration</w:t>
+      </w:r>
+    </w:p>
+    <w:p>
+      <w:pPr>
+        <w:spacing w:before="200" w:after="20"/>
+      </w:pPr>
+      <w:r>
+        <w:rPr>
+          <w:b/>
+          <w:color w:val="1A1A1A"/>
+          <w:sz w:val="22"/>
+        </w:rPr>
+        <w:t>Portfolio Application Lead</w:t>
+      </w:r>
+    </w:p>
+    <w:p>
+      <w:pPr>
+        <w:spacing w:after="80"/>
+      </w:pPr>
+      <w:r>
+        <w:rPr>
+          <w:color w:val="1A1A1A"/>
+          <w:sz w:val="20"/>
+        </w:rPr>
+        <w:t>Credit Suisse AG</w:t>
+      </w:r>
+      <w:r>
+        <w:rPr>
+          <w:color w:val="999999"/>
+          <w:sz w:val="18"/>
+        </w:rPr>
+        <w:t xml:space="preserve">    Zurich, Switzerland    March 2013 — June 2017</w:t>
+      </w:r>
+    </w:p>
+    <w:p>
+      <w:pPr>
+        <w:spacing w:after="80"/>
+      </w:pPr>
+      <w:r>
+        <w:rPr>
+          <w:i/>
+          <w:color w:val="5A5A5A"/>
+          <w:sz w:val="19"/>
+        </w:rPr>
+        <w:t>Ran a global-scale portfolio application with a team of 50.</w:t>
+      </w:r>
+    </w:p>
+    <w:p>
+      <w:pPr>
+        <w:spacing w:after="40"/>
+        <w:ind w:left="216"/>
+      </w:pPr>
+      <w:r>
+        <w:rPr>
+          <w:color w:val="1A1A1A"/>
+          <w:sz w:val="19"/>
+        </w:rPr>
+        <w:t>•  Managed 50 people across development, operations and business analysis for a bank-wide portfolio platform</w:t>
+      </w:r>
+    </w:p>
+    <w:p>
+      <w:pPr>
+        <w:spacing w:after="40"/>
+        <w:ind w:left="216"/>
+      </w:pPr>
+      <w:r>
+        <w:rPr>
+          <w:color w:val="1A1A1A"/>
+          <w:sz w:val="19"/>
+        </w:rPr>
+        <w:t>•  Owned the application on global scale — reliability, feature delivery and stakeholder management across front office, risk and operations</w:t>
+      </w:r>
+    </w:p>
+    <w:p>
+      <w:pPr>
+        <w:spacing w:after="40"/>
+        <w:ind w:left="216"/>
+      </w:pPr>
+      <w:r>
+        <w:rPr>
+          <w:color w:val="1A1A1A"/>
+          <w:sz w:val="19"/>
+        </w:rPr>
+        <w:t>•  Coordinated cross-functional delivery across trading desks, risk management and compliance</w:t>
+      </w:r>
+    </w:p>
+    <w:p>
+      <w:pPr>
+        <w:spacing w:after="40"/>
+        <w:ind w:left="216"/>
+      </w:pPr>
+      <w:r>
+        <w:rPr>
+          <w:color w:val="1A1A1A"/>
+          <w:sz w:val="19"/>
+        </w:rPr>
+        <w:t>•  High-availability environment serving thousands of internal users across multiple regions</w:t>
+      </w:r>
+    </w:p>
+    <w:p>
+      <w:pPr>
+        <w:spacing w:before="320" w:after="120"/>
+      </w:pPr>
+      <w:r>
+        <w:rPr>
+          <w:rFonts w:ascii="Calibri" w:hAnsi="Calibri"/>
+          <w:b/>
+          <w:color w:val="1B3A5C"/>
+          <w:sz w:val="18"/>
+        </w:rPr>
+        <w:t>EDUCATION</w:t>
+      </w:r>
+    </w:p>
+    <w:p>
+      <w:pPr>
+        <w:spacing w:after="160"/>
+      </w:pPr>
+      <w:r>
+        <w:rPr>
           <w:color w:val="DDDDDD"/>
-          <w:sz w:val="12"/>
+          <w:sz w:val="8"/>
         </w:rPr>
-        <w:t>_____________________________________________________________________________________</w:t>
+        <w:t>───────────────────────────────────────────────────────────────────────────────────────────────</w:t>
+      </w:r>
+    </w:p>
+    <w:p>
+      <w:pPr>
+        <w:spacing w:before="80" w:after="20"/>
+      </w:pPr>
+      <w:r>
+        <w:rPr>
+          <w:b/>
+          <w:color w:val="1A1A1A"/>
+          <w:sz w:val="20"/>
+        </w:rPr>
+        <w:t>MSc, Software Engineering &amp; Machine Learning</w:t>
+      </w:r>
+    </w:p>
+    <w:p>
+      <w:pPr>
+        <w:spacing w:after="160"/>
+      </w:pPr>
+      <w:r>
+        <w:rPr>
+          <w:color w:val="5A5A5A"/>
+          <w:sz w:val="19"/>
+        </w:rPr>
+        <w:t>Hong Kong Polytechnic University     2012 — 2013     Grade: 1.5 (top 10%)</w:t>
       </w:r>
     </w:p>
     <w:p>
       <w:pPr>
         <w:spacing w:after="20"/>
-        <w:ind w:left="288"/>
+      </w:pPr>
+      <w:r>
+        <w:rPr>
+          <w:b/>
+          <w:color w:val="1A1A1A"/>
+          <w:sz w:val="20"/>
+        </w:rPr>
+        <w:t>BSc, Enterprise Information Systems</w:t>
+      </w:r>
+    </w:p>
+    <w:p>
+      <w:pPr>
+        <w:spacing w:after="80"/>
+      </w:pPr>
+      <w:r>
+        <w:rPr>
+          <w:color w:val="5A5A5A"/>
+          <w:sz w:val="19"/>
+        </w:rPr>
+        <w:t>University of Applied Sciences Konstanz, Germany     2010 — 2013     Grade: 1.5 (top 10%)</w:t>
+      </w:r>
+    </w:p>
+    <w:p>
+      <w:pPr>
+        <w:spacing w:before="320" w:after="120"/>
       </w:pPr>
       <w:r>
         <w:rPr>
           <w:rFonts w:ascii="Calibri" w:hAnsi="Calibri"/>
-          <w:sz w:val="19"/>
+          <w:b/>
+          <w:color w:val="1B3A5C"/>
+          <w:sz w:val="18"/>
         </w:rPr>
-        <w:t>–  Managed teams of 50–60 in quota-carrying and delivery roles at Credit Suisse and Lykke</w:t>
+        <w:t>LANGUAGES</w:t>
       </w:r>
     </w:p>
     <w:p>
       <w:pPr>
-        <w:spacing w:after="20"/>
-        <w:ind w:left="288"/>
+        <w:spacing w:after="160"/>
       </w:pPr>
       <w:r>
         <w:rPr>
-          <w:rFonts w:ascii="Calibri" w:hAnsi="Calibri"/>
-          <w:sz w:val="19"/>
+          <w:color w:val="DDDDDD"/>
+          <w:sz w:val="8"/>
         </w:rPr>
-        <w:t>–  Sold SaaS and AI platforms totalling tens of millions USD to banks, OEMs, insurers and retail corps</w:t>
+        <w:t>───────────────────────────────────────────────────────────────────────────────────────────────</w:t>
       </w:r>
     </w:p>
     <w:p>
-      <w:pPr>
-        <w:spacing w:after="20"/>
-        <w:ind w:left="288"/>
-      </w:pPr>
       <w:r>
         <w:rPr>
-          <w:rFonts w:ascii="Calibri" w:hAnsi="Calibri"/>
-          <w:sz w:val="19"/>
+          <w:color w:val="1A1A1A"/>
+          <w:sz w:val="20"/>
         </w:rPr>
-        <w:t>–  Built two companies from zero — one to $10M+ revenue in year one</w:t>
-      </w:r>
-    </w:p>
-    <w:p>
-      <w:pPr>
-        <w:spacing w:after="20"/>
-        <w:ind w:left="288"/>
-      </w:pPr>
-      <w:r>
-        <w:rPr>
-          <w:rFonts w:ascii="Calibri" w:hAnsi="Calibri"/>
-          <w:sz w:val="19"/>
-        </w:rPr>
-        <w:t>–  Deploying production AI on Google Cloud today: Vertex AI, Gemini, Cloud Run</w:t>
-      </w:r>
-    </w:p>
-    <w:p>
-      <w:pPr>
-        <w:spacing w:after="20"/>
-        <w:ind w:left="288"/>
-      </w:pPr>
-      <w:r>
-        <w:rPr>
-          <w:rFonts w:ascii="Calibri" w:hAnsi="Calibri"/>
-          <w:sz w:val="19"/>
-        </w:rPr>
-        <w:t>–  Closed BMW, Allianz, Emaar and a 250K vehicle/year automotive group through direct sales</w:t>
-      </w:r>
-    </w:p>
-    <w:p>
-      <w:pPr>
-        <w:spacing w:after="20"/>
-        <w:ind w:left="288"/>
-      </w:pPr>
-      <w:r>
-        <w:rPr>
-          <w:rFonts w:ascii="Calibri" w:hAnsi="Calibri"/>
-          <w:sz w:val="19"/>
-        </w:rPr>
-        <w:t>–  Technical enough to architect an AI solution, demo it and close the deal in the same meeting</w:t>
-      </w:r>
-    </w:p>
-    <w:p>
-      <w:pPr>
-        <w:spacing w:after="20"/>
-        <w:ind w:left="288"/>
-      </w:pPr>
-      <w:r>
-        <w:rPr>
-          <w:rFonts w:ascii="Calibri" w:hAnsi="Calibri"/>
-          <w:sz w:val="19"/>
-        </w:rPr>
-        <w:t>–  Managed an open-source ML product with active researcher community on GitHub</w:t>
-      </w:r>
-    </w:p>
-    <w:p>
-      <w:pPr>
-        <w:spacing w:after="20"/>
-        <w:ind w:left="288"/>
-      </w:pPr>
-      <w:r>
-        <w:rPr>
-          <w:rFonts w:ascii="Calibri" w:hAnsi="Calibri"/>
-          <w:sz w:val="19"/>
-        </w:rPr>
-        <w:t>–  NVIDIA Inception member. Connected to Google for Startups Zurich</w:t>
+        <w:t>English (native)     Russian (native)     German (professional)</w:t>
       </w:r>
     </w:p>
     <w:sectPr>
       <w:pgSz w:w="12240" w:h="15840"/>
-      <w:pgMar w:top="864" w:right="1008" w:bottom="720" w:left="1008" w:header="720" w:footer="720" w:gutter="0"/>
+      <w:pgMar w:top="936" w:right="1080" w:bottom="720" w:left="1080" w:header="720" w:footer="720" w:gutter="0"/>
       <w:cols w:space="720"/>
       <w:docGrid w:linePitch="360"/>
     </w:sectPr>
@@ -1217,10 +1080,11 @@
     <w:qFormat/>
     <w:rsid w:val="00FC693F"/>
     <w:pPr>
-      <w:spacing w:after="40" w:before="0"/>
+      <w:spacing w:after="0" w:before="0" w:line="276" w:lineRule="auto"/>
     </w:pPr>
     <w:rPr>
       <w:rFonts w:ascii="Calibri" w:hAnsi="Calibri"/>
+      <w:color w:val="1A1A1A"/>
       <w:sz w:val="20"/>
     </w:rPr>
   </w:style>

</xml_diff>

<commit_message>
Clean up CV, remove AI patterns
Co-Authored-By: Claude Opus 4.6 <noreply@anthropic.com>
</commit_message>
<xml_diff>
--- a/CV_ViktorAndreas_GoogleCloud.docx
+++ b/CV_ViktorAndreas_GoogleCloud.docx
@@ -100,7 +100,7 @@
           <w:color w:val="999999"/>
           <w:sz w:val="18"/>
         </w:rPr>
-        <w:t xml:space="preserve">    Zug, Switzerland    2023 — Present</w:t>
+        <w:t xml:space="preserve">    Zug, Switzerland    2023 - Present</w:t>
       </w:r>
     </w:p>
     <w:p>
@@ -113,7 +113,7 @@
           <w:color w:val="5A5A5A"/>
           <w:sz w:val="19"/>
         </w:rPr>
-        <w:t>Built and sell an AI platform-as-a-service replacing dealership sales and service teams with autonomous agents. Voice, chat, WhatsApp — 12+ languages, 24/7. Entire stack on Google Cloud.</w:t>
+        <w:t>Built and sell an AI platform-as-a-service replacing dealership sales and service teams with autonomous agents. Voice, chat, WhatsApp. 12+ languages, 24/7. Entire stack on Google Cloud.</w:t>
       </w:r>
     </w:p>
     <w:p>
@@ -126,7 +126,7 @@
           <w:color w:val="1A1A1A"/>
           <w:sz w:val="19"/>
         </w:rPr>
-        <w:t>•  Defined and executed full go-to-market. Acquired BMW KSA, Naghi Group (250K cars/year, 6 brands), Allianz, Emaar and Suhner as paying customers</w:t>
+        <w:t>- Built the go-to-market from scratch. Acquired BMW KSA, Naghi Group (250K cars/year, 6 brands), Allianz, Emaar and Suhner as paying customers</w:t>
       </w:r>
     </w:p>
     <w:p>
@@ -139,7 +139,7 @@
           <w:color w:val="1A1A1A"/>
           <w:sz w:val="19"/>
         </w:rPr>
-        <w:t>•  Closed enterprise deals through live technical PoCs — single demo to signed contract in under 30 days</w:t>
+        <w:t>- Closed enterprise deals through live technical PoCs, single demo to signed contract in under 30 days</w:t>
       </w:r>
     </w:p>
     <w:p>
@@ -152,7 +152,7 @@
           <w:color w:val="1A1A1A"/>
           <w:sz w:val="19"/>
         </w:rPr>
-        <w:t>•  Built and lead cross-functional team across engineering, AI research, sales and customer success in Switzerland and Saudi Arabia</w:t>
+        <w:t>- Built and lead cross-functional team across engineering, AI research, sales and customer success in Switzerland and Saudi Arabia</w:t>
       </w:r>
     </w:p>
     <w:p>
@@ -165,7 +165,7 @@
           <w:color w:val="1A1A1A"/>
           <w:sz w:val="19"/>
         </w:rPr>
-        <w:t>•  Platform processes 4,000+ voice calls/month, 300 daily autonomous interactions, zero human handoff</w:t>
+        <w:t>- Platform processes 4,000+ voice calls/month, 300 daily autonomous interactions</w:t>
       </w:r>
     </w:p>
     <w:p>
@@ -178,7 +178,7 @@
           <w:color w:val="1A1A1A"/>
           <w:sz w:val="19"/>
         </w:rPr>
-        <w:t>•  Production on GCP: Vertex AI, Gemini models, Cloud Run, BigQuery. Voice pipeline at sub-400ms latency</w:t>
+        <w:t>- Production on GCP: Vertex AI, Gemini models, Cloud Run, BigQuery. Voice pipeline at sub-400ms latency</w:t>
       </w:r>
     </w:p>
     <w:p>
@@ -191,7 +191,7 @@
           <w:color w:val="1A1A1A"/>
           <w:sz w:val="19"/>
         </w:rPr>
-        <w:t>•  NVIDIA Inception member. Working with Google for Startups team in Zurich</w:t>
+        <w:t>- NVIDIA Inception member. Working with Google for Startups team in Zurich</w:t>
       </w:r>
     </w:p>
     <w:p>
@@ -204,7 +204,7 @@
           <w:color w:val="1A1A1A"/>
           <w:sz w:val="19"/>
         </w:rPr>
-        <w:t>•  Assembled advisory board: ex-CFO Sitecore, ex-CRO EMEA SAP, ex-Managing Director BMW Middle East</w:t>
+        <w:t>- Brought on advisory board: ex-CFO Sitecore, ex-CRO EMEA SAP, ex-Managing Director BMW Middle East</w:t>
       </w:r>
     </w:p>
     <w:p>
@@ -236,7 +236,7 @@
           <w:color w:val="999999"/>
           <w:sz w:val="18"/>
         </w:rPr>
-        <w:t xml:space="preserve">    Basel / Open Source    December 2021 — January 2024</w:t>
+        <w:t xml:space="preserve">    Basel / Open Source    December 2021 - January 2024</w:t>
       </w:r>
     </w:p>
     <w:p>
@@ -262,7 +262,7 @@
           <w:color w:val="1A1A1A"/>
           <w:sz w:val="19"/>
         </w:rPr>
-        <w:t>•  Sold and positioned the platform to research institutions and university labs</w:t>
+        <w:t>- Sold and positioned the platform to research institutions and university labs</w:t>
       </w:r>
     </w:p>
     <w:p>
@@ -275,7 +275,7 @@
           <w:color w:val="1A1A1A"/>
           <w:sz w:val="19"/>
         </w:rPr>
-        <w:t>•  Worked with ML engineering team on Google model integration — classification, data extraction, experiment automation</w:t>
+        <w:t>- Worked with ML engineering team on Google model integration, classification, data extraction, experiment automation</w:t>
       </w:r>
     </w:p>
     <w:p>
@@ -288,7 +288,7 @@
           <w:color w:val="1A1A1A"/>
           <w:sz w:val="19"/>
         </w:rPr>
-        <w:t>•  Managed the open-source community on GitHub — contributor relations, roadmap input from researchers</w:t>
+        <w:t>- Managed the open-source community on GitHub, contributor relations, roadmap input from researchers</w:t>
       </w:r>
     </w:p>
     <w:p>
@@ -301,7 +301,7 @@
           <w:color w:val="1A1A1A"/>
           <w:sz w:val="19"/>
         </w:rPr>
-        <w:t>•  Grew user community across pharmaceutical and life science research groups</w:t>
+        <w:t>- Grew user community across pharmaceutical and life science research groups</w:t>
       </w:r>
     </w:p>
     <w:p>
@@ -333,7 +333,7 @@
           <w:color w:val="999999"/>
           <w:sz w:val="18"/>
         </w:rPr>
-        <w:t xml:space="preserve">    Zurich, Switzerland    November 2018 — July 2020</w:t>
+        <w:t xml:space="preserve">    Zurich, Switzerland    November 2018 - July 2020</w:t>
       </w:r>
     </w:p>
     <w:p>
@@ -359,7 +359,7 @@
           <w:color w:val="1A1A1A"/>
           <w:sz w:val="19"/>
         </w:rPr>
-        <w:t>•  Grew revenue from single-digit millions to eight figures, selling to banks, financial institutions and large retail corporations including Emaar</w:t>
+        <w:t>- Grew revenue from single-digit millions to eight figures, selling to banks, financial institutions and large retail corporations including Emaar</w:t>
       </w:r>
     </w:p>
     <w:p>
@@ -372,7 +372,7 @@
           <w:color w:val="1A1A1A"/>
           <w:sz w:val="19"/>
         </w:rPr>
-        <w:t>•  Built and managed a 60-person organization across sales, business development, product and operations</w:t>
+        <w:t>- Built and managed a 60-person organization across sales, business development, product and operations</w:t>
       </w:r>
     </w:p>
     <w:p>
@@ -385,7 +385,7 @@
           <w:color w:val="1A1A1A"/>
           <w:sz w:val="19"/>
         </w:rPr>
-        <w:t>•  Closed multi-million USD platform deals across DACH, Middle East and Asia</w:t>
+        <w:t>- Closed multi-million USD platform deals across DACH, Middle East and Asia</w:t>
       </w:r>
     </w:p>
     <w:p>
@@ -398,7 +398,7 @@
           <w:color w:val="1A1A1A"/>
           <w:sz w:val="19"/>
         </w:rPr>
-        <w:t>•  Defined pricing, sales playbooks and channel partnerships for institutional SaaS distribution</w:t>
+        <w:t>- Defined pricing, sales playbooks and channel partnerships for institutional SaaS distribution</w:t>
       </w:r>
     </w:p>
     <w:p>
@@ -411,7 +411,7 @@
           <w:color w:val="1A1A1A"/>
           <w:sz w:val="22"/>
         </w:rPr>
-        <w:t>Product Manager — Wealth Platform</w:t>
+        <w:t>Product Manager, Wealth Platform</w:t>
       </w:r>
     </w:p>
     <w:p>
@@ -430,7 +430,7 @@
           <w:color w:val="999999"/>
           <w:sz w:val="18"/>
         </w:rPr>
-        <w:t xml:space="preserve">    Zurich, Switzerland    August 2017 — September 2018</w:t>
+        <w:t xml:space="preserve">    Zurich, Switzerland    August 2017 - September 2018</w:t>
       </w:r>
     </w:p>
     <w:p>
@@ -443,7 +443,7 @@
           <w:color w:val="5A5A5A"/>
           <w:sz w:val="19"/>
         </w:rPr>
-        <w:t>Owned the product and commercial side of one of Europe’s leading digital wealth applications. Hybrid role — half product, half enterprise sales.</w:t>
+        <w:t>Owned the product and commercial side of one of Europe’s leading digital wealth applications. Hybrid role, half product half enterprise sales.</w:t>
       </w:r>
     </w:p>
     <w:p>
@@ -456,7 +456,7 @@
           <w:color w:val="1A1A1A"/>
           <w:sz w:val="19"/>
         </w:rPr>
-        <w:t>•  Ran enterprise sales cycles end to end — from first call and technical scoping through to contract close with private banks</w:t>
+        <w:t>- Ran enterprise sales cycles end to end, from first call and technical scoping through to contract close with private banks</w:t>
       </w:r>
     </w:p>
     <w:p>
@@ -469,7 +469,7 @@
           <w:color w:val="1A1A1A"/>
           <w:sz w:val="19"/>
         </w:rPr>
-        <w:t>•  Grew platform adoption across private banking and institutional asset management clients in DACH</w:t>
+        <w:t>- Grew adoption across private banking and institutional asset management clients in DACH</w:t>
       </w:r>
     </w:p>
     <w:p>
@@ -482,7 +482,7 @@
           <w:color w:val="1A1A1A"/>
           <w:sz w:val="19"/>
         </w:rPr>
-        <w:t>•  Sat between clients and engineering — turned what wealth managers actually needed into features that shipped</w:t>
+        <w:t>- Worked between clients and engineering, turned what wealth managers actually needed into features that shipped</w:t>
       </w:r>
     </w:p>
     <w:p>
@@ -495,7 +495,7 @@
           <w:color w:val="1A1A1A"/>
           <w:sz w:val="19"/>
         </w:rPr>
-        <w:t>•  Navigated regulated environments: Swiss banking compliance, data sovereignty, legacy core banking integration</w:t>
+        <w:t>- Worked in regulated environment: Swiss banking compliance, data sovereignty, legacy core banking integration</w:t>
       </w:r>
     </w:p>
     <w:p>
@@ -527,7 +527,7 @@
           <w:color w:val="999999"/>
           <w:sz w:val="18"/>
         </w:rPr>
-        <w:t xml:space="preserve">    Zurich, Switzerland    March 2013 — June 2017</w:t>
+        <w:t xml:space="preserve">    Zurich, Switzerland    March 2013 - June 2017</w:t>
       </w:r>
     </w:p>
     <w:p>
@@ -553,7 +553,7 @@
           <w:color w:val="1A1A1A"/>
           <w:sz w:val="19"/>
         </w:rPr>
-        <w:t>•  Managed 50 people across development, operations and business analysis for a bank-wide portfolio platform</w:t>
+        <w:t>- Managed 50 people across development, operations and business analysis for a bank-wide portfolio platform</w:t>
       </w:r>
     </w:p>
     <w:p>
@@ -566,7 +566,7 @@
           <w:color w:val="1A1A1A"/>
           <w:sz w:val="19"/>
         </w:rPr>
-        <w:t>•  Owned the application on global scale — reliability, feature delivery and stakeholder management across front office, risk and operations</w:t>
+        <w:t>- Owned the application on global scale, reliability, feature delivery and stakeholder management across front office, risk and operations</w:t>
       </w:r>
     </w:p>
     <w:p>
@@ -579,7 +579,7 @@
           <w:color w:val="1A1A1A"/>
           <w:sz w:val="19"/>
         </w:rPr>
-        <w:t>•  Coordinated cross-functional delivery across trading desks, risk management and compliance</w:t>
+        <w:t>- Worked across trading desks, risk management and compliance</w:t>
       </w:r>
     </w:p>
     <w:p>
@@ -592,7 +592,7 @@
           <w:color w:val="1A1A1A"/>
           <w:sz w:val="19"/>
         </w:rPr>
-        <w:t>•  High-availability environment serving thousands of internal users across multiple regions</w:t>
+        <w:t>- Platform served thousands of internal users across multiple regions</w:t>
       </w:r>
     </w:p>
     <w:p>
@@ -643,7 +643,7 @@
           <w:color w:val="5A5A5A"/>
           <w:sz w:val="19"/>
         </w:rPr>
-        <w:t>Hong Kong Polytechnic University     2012 — 2013     Grade: 1.5 (top 10%)</w:t>
+        <w:t>Hong Kong Polytechnic University     2012 - 2013     Grade: 1.5 (top 10%)</w:t>
       </w:r>
     </w:p>
     <w:p>
@@ -668,7 +668,7 @@
           <w:color w:val="5A5A5A"/>
           <w:sz w:val="19"/>
         </w:rPr>
-        <w:t>University of Applied Sciences Konstanz, Germany     2010 — 2013     Grade: 1.5 (top 10%)</w:t>
+        <w:t>University of Applied Sciences Konstanz, Germany     2010 - 2013     Grade: 1.5 (top 10%)</w:t>
       </w:r>
     </w:p>
     <w:p>

</xml_diff>